<commit_message>
Update acceptance, validation, and get-well docs to current status
Reflect Li & Briggs two-stage road identification (Stage 1 complete,
Stage 2 in progress), auto-screenshot tool committed to GitHub, and
refreshed Sprint 2 target dates (completion target 11/02/2026).

Co-Authored-By: Claude Opus 4.8 <noreply@anthropic.com>
Claude-Session: https://claude.ai/code/session_017p6mccK4XQFabfMDvMtD8S
</commit_message>
<xml_diff>
--- a/docs/11-Acceptance-Statement-FILLED.docx
+++ b/docs/11-Acceptance-Statement-FILLED.docx
@@ -358,7 +358,7 @@
         <w:rPr>
           <w:color w:val="000000"/>
         </w:rPr>
-        <w:t>Overall summary: During Sprint 0–1 the team established the Navi-Gator project artifacts (PID, Proposal, Requirements, Design, Definition of Done, Product Backlog) and delivered working prototypes: the SQL image database schema, the Flask + SQLite + HTML front-end integration, the location-determination and Geoapify routing prototypes, Cloudflare R2 image storage, image preprocessing, and the auto-screenshot capture tool, plus the road-condition classification research. Deviations from the plan (hosting change to Cloudflare R2 + GitHub LFS, the road-isolation method pivot, the imagery-resolution feasibility finding, and the deferral of CNN classification) are documented and justified in the Navi-Gator Validation Summary, Section 3 (Variations from Plan).</w:t>
+        <w:t>Overall summary: During Sprint 0–1 the team established the Navi-Gator project artifacts (PID, Proposal, Requirements, Design, Definition of Done, Product Backlog) and delivered working prototypes: the SQL image database schema, the Flask + SQLite + HTML front-end integration, the location-determination and Geoapify routing prototypes, Cloudflare R2 image storage, image preprocessing, and the auto-screenshot capture tool (committed to GitHub), plus the road-condition classification research. Road identification is being implemented with the Li &amp; Briggs two-stage method: Stage 1 (linear-feature detection, grouping and extraction) is complete and committed; Stage 2 (asphalt spectral-signature resweep, with checks to reject trees and railroad tracks) is in progress. Deviations from the plan (hosting change to Cloudflare R2 + GitHub LFS, the road-identification method change, the imagery-resolution feasibility finding, and the deferral of CNN classification) are documented and justified in the Navi-Gator Validation Summary, Section 3 (Variations from Plan).</w:t>
       </w:r>
     </w:p>
     <w:p>
@@ -514,7 +514,7 @@
               <w:rPr>
                 <w:color w:val="000000"/>
               </w:rPr>
-              <w:t>Initial release — Acceptance of the Navi-Gator Sprint 1 prototype milestone.</w:t>
+              <w:t>Acceptance of the Navi-Gator Sprint 1 prototype milestone; reflects road-identification Stage 1 complete (Stage 2 in progress) and auto-screenshot upload.</w:t>
             </w:r>
           </w:p>
         </w:tc>

</xml_diff>